<commit_message>
Claude: add free-start payment gateway strategy
</commit_message>
<xml_diff>
--- a/ASMR & SAMR - Claude Strategy & Findings.docx
+++ b/ASMR & SAMR - Claude Strategy & Findings.docx
@@ -6039,6 +6039,1702 @@
           <w:color w:val="6B645C"/>
         </w:rPr>
         <w:t xml:space="preserve">Everything not in this list — the A-lock test, section re-probes after migration, cache-busting, storefront data-wiring behind a flag — I can do without any credentials.</w:t>
+      </w:r>
+    </w:p>
+    <w:p>
+      <w:r>
+        <w:br w:type="page"/>
+      </w:r>
+    </w:p>
+    <w:p>
+      <w:pPr>
+        <w:keepNext/>
+        <w:spacing w:before="200" w:after="120"/>
+      </w:pPr>
+      <w:r>
+        <w:rPr>
+          <w:b/>
+          <w:sz w:val="32"/>
+        </w:rPr>
+        <w:t>Part IV - Free-Start Payment Gateway Strategy</w:t>
+      </w:r>
+    </w:p>
+    <w:p>
+      <w:r>
+        <w:rPr>
+          <w:b/>
+        </w:rPr>
+        <w:t xml:space="preserve">Reviewed: 2026-07-18. </w:t>
+      </w:r>
+      <w:r>
+        <w:t>Goal: choose a payment path that keeps ASMR &amp; SAMR free to operate at launch while allowing a clean upgrade from WhatsApp checkout to hosted payment links or a gateway later.</w:t>
+      </w:r>
+    </w:p>
+    <w:p>
+      <w:pPr>
+        <w:keepNext/>
+        <w:spacing w:before="200" w:after="120"/>
+      </w:pPr>
+      <w:r>
+        <w:rPr>
+          <w:b/>
+          <w:sz w:val="24"/>
+        </w:rPr>
+        <w:t>Decision Summary</w:t>
+      </w:r>
+    </w:p>
+    <w:p>
+      <w:pPr>
+        <w:spacing w:after="60"/>
+        <w:ind w:left="360" w:hanging="200"/>
+      </w:pPr>
+      <w:r>
+        <w:rPr>
+          <w:sz w:val="19"/>
+        </w:rPr>
+        <w:t xml:space="preserve">- </w:t>
+      </w:r>
+      <w:r>
+        <w:rPr>
+          <w:b/>
+          <w:sz w:val="19"/>
+        </w:rPr>
+        <w:t xml:space="preserve">Best zero-cost launch path: </w:t>
+      </w:r>
+      <w:r>
+        <w:rPr>
+          <w:sz w:val="19"/>
+        </w:rPr>
+        <w:t>Keep WhatsApp checkout now, then request payment manually by bank transfer, STC Pay/QR where available, or provider payment link. This has no gateway subscription, but it is operationally manual.</w:t>
+      </w:r>
+    </w:p>
+    <w:p>
+      <w:pPr>
+        <w:spacing w:after="60"/>
+        <w:ind w:left="360" w:hanging="200"/>
+      </w:pPr>
+      <w:r>
+        <w:rPr>
+          <w:sz w:val="19"/>
+        </w:rPr>
+        <w:t xml:space="preserve">- </w:t>
+      </w:r>
+      <w:r>
+        <w:rPr>
+          <w:b/>
+          <w:sz w:val="19"/>
+        </w:rPr>
+        <w:t xml:space="preserve">Best free-start gateway candidate: </w:t>
+      </w:r>
+      <w:r>
+        <w:rPr>
+          <w:sz w:val="19"/>
+        </w:rPr>
+        <w:t>Paylink appears strongest for low-budget Saudi launch because its public terms show free setup and free monthly subscription, with per-transaction fees instead of fixed platform cost. Verify the exact package during onboarding.</w:t>
+      </w:r>
+    </w:p>
+    <w:p>
+      <w:pPr>
+        <w:spacing w:after="60"/>
+        <w:ind w:left="360" w:hanging="200"/>
+      </w:pPr>
+      <w:r>
+        <w:rPr>
+          <w:sz w:val="19"/>
+        </w:rPr>
+        <w:t xml:space="preserve">- </w:t>
+      </w:r>
+      <w:r>
+        <w:rPr>
+          <w:b/>
+          <w:sz w:val="19"/>
+        </w:rPr>
+        <w:t xml:space="preserve">Best polished payment-link/gateway candidates: </w:t>
+      </w:r>
+      <w:r>
+        <w:rPr>
+          <w:sz w:val="19"/>
+        </w:rPr>
+        <w:t>Tap Payments and Moyasar are credible Saudi/MENA options with payment links and local methods, but current public pages ask merchants to confirm pricing with sales or do not publish a full fixed price table.</w:t>
+      </w:r>
+    </w:p>
+    <w:p>
+      <w:pPr>
+        <w:spacing w:after="60"/>
+        <w:ind w:left="360" w:hanging="200"/>
+      </w:pPr>
+      <w:r>
+        <w:rPr>
+          <w:sz w:val="19"/>
+        </w:rPr>
+        <w:t xml:space="preserve">- </w:t>
+      </w:r>
+      <w:r>
+        <w:rPr>
+          <w:b/>
+          <w:sz w:val="19"/>
+        </w:rPr>
+        <w:t xml:space="preserve">Not recommended as first choice: </w:t>
+      </w:r>
+      <w:r>
+        <w:rPr>
+          <w:sz w:val="19"/>
+        </w:rPr>
+        <w:t>Stripe is not a direct Saudi merchant option based on Stripe global availability; PayTabs shows a SAR 49/month app plan; PayPal is useful as an international fallback but weak for local mada-first Saudi checkout.</w:t>
+      </w:r>
+    </w:p>
+    <w:p>
+      <w:pPr>
+        <w:keepNext/>
+        <w:spacing w:before="200" w:after="120"/>
+      </w:pPr>
+      <w:r>
+        <w:rPr>
+          <w:b/>
+          <w:sz w:val="24"/>
+        </w:rPr>
+        <w:t>Free-Start Options Compared</w:t>
+      </w:r>
+    </w:p>
+    <w:tbl>
+      <w:tblPr>
+        <w:tblW w:type="auto" w:w="0"/>
+        <w:jc w:val="center"/>
+        <w:tblLook w:firstColumn="1" w:firstRow="1" w:lastColumn="0" w:lastRow="0" w:noHBand="0" w:noVBand="1" w:val="04A0"/>
+        <w:tblBorders>
+          <w:top w:val="single" w:sz="4" w:space="0" w:color="C8BFAF"/>
+          <w:left w:val="single" w:sz="4" w:space="0" w:color="C8BFAF"/>
+          <w:bottom w:val="single" w:sz="4" w:space="0" w:color="C8BFAF"/>
+          <w:right w:val="single" w:sz="4" w:space="0" w:color="C8BFAF"/>
+          <w:insideH w:val="single" w:sz="4" w:space="0" w:color="C8BFAF"/>
+          <w:insideV w:val="single" w:sz="4" w:space="0" w:color="C8BFAF"/>
+        </w:tblBorders>
+      </w:tblPr>
+      <w:tblGrid>
+        <w:gridCol w:w="2376"/>
+        <w:gridCol w:w="2376"/>
+        <w:gridCol w:w="2376"/>
+        <w:gridCol w:w="2376"/>
+      </w:tblGrid>
+      <w:tr>
+        <w:tc>
+          <w:tcPr>
+            <w:tcW w:type="dxa" w:w="1944"/>
+            <w:vAlign w:val="center"/>
+          </w:tcPr>
+          <w:p>
+            <w:r>
+              <w:rPr>
+                <w:b/>
+                <w:sz w:val="17"/>
+              </w:rPr>
+              <w:t>Option</w:t>
+            </w:r>
+          </w:p>
+        </w:tc>
+        <w:tc>
+          <w:tcPr>
+            <w:tcW w:type="dxa" w:w="2448"/>
+            <w:vAlign w:val="center"/>
+          </w:tcPr>
+          <w:p>
+            <w:r>
+              <w:rPr>
+                <w:b/>
+                <w:sz w:val="17"/>
+              </w:rPr>
+              <w:t>Free-start status</w:t>
+            </w:r>
+          </w:p>
+        </w:tc>
+        <w:tc>
+          <w:tcPr>
+            <w:tcW w:type="dxa" w:w="3024"/>
+            <w:vAlign w:val="center"/>
+          </w:tcPr>
+          <w:p>
+            <w:r>
+              <w:rPr>
+                <w:b/>
+                <w:sz w:val="17"/>
+              </w:rPr>
+              <w:t>Fit for ASMR &amp; SAMR</w:t>
+            </w:r>
+          </w:p>
+        </w:tc>
+        <w:tc>
+          <w:tcPr>
+            <w:tcW w:type="dxa" w:w="1944"/>
+            <w:vAlign w:val="center"/>
+          </w:tcPr>
+          <w:p>
+            <w:r>
+              <w:rPr>
+                <w:b/>
+                <w:sz w:val="17"/>
+              </w:rPr>
+              <w:t>Decision</w:t>
+            </w:r>
+          </w:p>
+        </w:tc>
+      </w:tr>
+      <w:tr>
+        <w:tc>
+          <w:tcPr>
+            <w:tcW w:type="dxa" w:w="1944"/>
+            <w:vAlign w:val="top"/>
+          </w:tcPr>
+          <w:p>
+            <w:pPr>
+              <w:spacing w:after="40"/>
+            </w:pPr>
+            <w:r>
+              <w:rPr>
+                <w:sz w:val="16"/>
+              </w:rPr>
+              <w:t>WhatsApp + manual transfer / wallet / COD</w:t>
+            </w:r>
+          </w:p>
+        </w:tc>
+        <w:tc>
+          <w:tcPr>
+            <w:tcW w:type="dxa" w:w="2448"/>
+            <w:vAlign w:val="top"/>
+          </w:tcPr>
+          <w:p>
+            <w:pPr>
+              <w:spacing w:after="40"/>
+            </w:pPr>
+            <w:r>
+              <w:rPr>
+                <w:sz w:val="16"/>
+              </w:rPr>
+              <w:t>No gateway subscription. Bank or wallet fees may still apply.</w:t>
+            </w:r>
+          </w:p>
+        </w:tc>
+        <w:tc>
+          <w:tcPr>
+            <w:tcW w:type="dxa" w:w="3024"/>
+            <w:vAlign w:val="top"/>
+          </w:tcPr>
+          <w:p>
+            <w:pPr>
+              <w:spacing w:after="40"/>
+            </w:pPr>
+            <w:r>
+              <w:rPr>
+                <w:sz w:val="16"/>
+              </w:rPr>
+              <w:t>Fastest and cheapest for soft launch. Works with the current site today.</w:t>
+            </w:r>
+          </w:p>
+        </w:tc>
+        <w:tc>
+          <w:tcPr>
+            <w:tcW w:type="dxa" w:w="1944"/>
+            <w:vAlign w:val="top"/>
+          </w:tcPr>
+          <w:p>
+            <w:pPr>
+              <w:spacing w:after="40"/>
+            </w:pPr>
+            <w:r>
+              <w:rPr>
+                <w:sz w:val="16"/>
+              </w:rPr>
+              <w:t>Keep as Phase D0 while payment provider onboarding is in progress.</w:t>
+            </w:r>
+          </w:p>
+        </w:tc>
+      </w:tr>
+      <w:tr>
+        <w:tc>
+          <w:tcPr>
+            <w:tcW w:type="dxa" w:w="1944"/>
+            <w:vAlign w:val="top"/>
+          </w:tcPr>
+          <w:p>
+            <w:pPr>
+              <w:spacing w:after="40"/>
+            </w:pPr>
+            <w:r>
+              <w:rPr>
+                <w:sz w:val="16"/>
+              </w:rPr>
+              <w:t>Paylink</w:t>
+            </w:r>
+          </w:p>
+        </w:tc>
+        <w:tc>
+          <w:tcPr>
+            <w:tcW w:type="dxa" w:w="2448"/>
+            <w:vAlign w:val="top"/>
+          </w:tcPr>
+          <w:p>
+            <w:pPr>
+              <w:spacing w:after="40"/>
+            </w:pPr>
+            <w:r>
+              <w:rPr>
+                <w:sz w:val="16"/>
+              </w:rPr>
+              <w:t>Public terms show setup free, monthly subscription free, mada 1%, Visa/Mastercard 2.75%, and SAR 1 fixed fee per transaction.</w:t>
+            </w:r>
+          </w:p>
+        </w:tc>
+        <w:tc>
+          <w:tcPr>
+            <w:tcW w:type="dxa" w:w="3024"/>
+            <w:vAlign w:val="top"/>
+          </w:tcPr>
+          <w:p>
+            <w:pPr>
+              <w:spacing w:after="40"/>
+            </w:pPr>
+            <w:r>
+              <w:rPr>
+                <w:sz w:val="16"/>
+              </w:rPr>
+              <w:t>Strong Saudi payment-link option for WhatsApp-led selling. Can start manually, then automate later through backend/Edge Function if API access is approved.</w:t>
+            </w:r>
+          </w:p>
+        </w:tc>
+        <w:tc>
+          <w:tcPr>
+            <w:tcW w:type="dxa" w:w="1944"/>
+            <w:vAlign w:val="top"/>
+          </w:tcPr>
+          <w:p>
+            <w:pPr>
+              <w:spacing w:after="40"/>
+            </w:pPr>
+            <w:r>
+              <w:rPr>
+                <w:sz w:val="16"/>
+              </w:rPr>
+              <w:t>Recommended first provider to try for free-start online payments.</w:t>
+            </w:r>
+          </w:p>
+        </w:tc>
+      </w:tr>
+      <w:tr>
+        <w:tc>
+          <w:tcPr>
+            <w:tcW w:type="dxa" w:w="1944"/>
+            <w:vAlign w:val="top"/>
+          </w:tcPr>
+          <w:p>
+            <w:pPr>
+              <w:spacing w:after="40"/>
+            </w:pPr>
+            <w:r>
+              <w:rPr>
+                <w:sz w:val="16"/>
+              </w:rPr>
+              <w:t>Tap Payments</w:t>
+            </w:r>
+          </w:p>
+        </w:tc>
+        <w:tc>
+          <w:tcPr>
+            <w:tcW w:type="dxa" w:w="2448"/>
+            <w:vAlign w:val="top"/>
+          </w:tcPr>
+          <w:p>
+            <w:pPr>
+              <w:spacing w:after="40"/>
+            </w:pPr>
+            <w:r>
+              <w:rPr>
+                <w:sz w:val="16"/>
+              </w:rPr>
+              <w:t>Saudi page emphasizes local acceptance and payment links; public pricing was not shown in the checked source.</w:t>
+            </w:r>
+          </w:p>
+        </w:tc>
+        <w:tc>
+          <w:tcPr>
+            <w:tcW w:type="dxa" w:w="3024"/>
+            <w:vAlign w:val="top"/>
+          </w:tcPr>
+          <w:p>
+            <w:pPr>
+              <w:spacing w:after="40"/>
+            </w:pPr>
+            <w:r>
+              <w:rPr>
+                <w:sz w:val="16"/>
+              </w:rPr>
+              <w:t>Good luxury-commerce fit: mada, Apple Pay, STC Pay, cards, BNPL/payment links, WhatsApp/social commerce.</w:t>
+            </w:r>
+          </w:p>
+        </w:tc>
+        <w:tc>
+          <w:tcPr>
+            <w:tcW w:type="dxa" w:w="1944"/>
+            <w:vAlign w:val="top"/>
+          </w:tcPr>
+          <w:p>
+            <w:pPr>
+              <w:spacing w:after="40"/>
+            </w:pPr>
+            <w:r>
+              <w:rPr>
+                <w:sz w:val="16"/>
+              </w:rPr>
+              <w:t>Contact sales; compare rate and settlement against Paylink before integration.</w:t>
+            </w:r>
+          </w:p>
+        </w:tc>
+      </w:tr>
+      <w:tr>
+        <w:tc>
+          <w:tcPr>
+            <w:tcW w:type="dxa" w:w="1944"/>
+            <w:vAlign w:val="top"/>
+          </w:tcPr>
+          <w:p>
+            <w:pPr>
+              <w:spacing w:after="40"/>
+            </w:pPr>
+            <w:r>
+              <w:rPr>
+                <w:sz w:val="16"/>
+              </w:rPr>
+              <w:t>Moyasar</w:t>
+            </w:r>
+          </w:p>
+        </w:tc>
+        <w:tc>
+          <w:tcPr>
+            <w:tcW w:type="dxa" w:w="2448"/>
+            <w:vAlign w:val="top"/>
+          </w:tcPr>
+          <w:p>
+            <w:pPr>
+              <w:spacing w:after="40"/>
+            </w:pPr>
+            <w:r>
+              <w:rPr>
+                <w:sz w:val="16"/>
+              </w:rPr>
+              <w:t>Public pages say fees/rates are provided by sales; dashboard and sandbox are available before full activation.</w:t>
+            </w:r>
+          </w:p>
+        </w:tc>
+        <w:tc>
+          <w:tcPr>
+            <w:tcW w:type="dxa" w:w="3024"/>
+            <w:vAlign w:val="top"/>
+          </w:tcPr>
+          <w:p>
+            <w:pPr>
+              <w:spacing w:after="40"/>
+            </w:pPr>
+            <w:r>
+              <w:rPr>
+                <w:sz w:val="16"/>
+              </w:rPr>
+              <w:t>Developer-friendly Saudi gateway with invoice/payment links and good future fit for Supabase Edge Function integration.</w:t>
+            </w:r>
+          </w:p>
+        </w:tc>
+        <w:tc>
+          <w:tcPr>
+            <w:tcW w:type="dxa" w:w="1944"/>
+            <w:vAlign w:val="top"/>
+          </w:tcPr>
+          <w:p>
+            <w:pPr>
+              <w:spacing w:after="40"/>
+            </w:pPr>
+            <w:r>
+              <w:rPr>
+                <w:sz w:val="16"/>
+              </w:rPr>
+              <w:t>Contact sales in parallel. Good second candidate if rates are close to Paylink.</w:t>
+            </w:r>
+          </w:p>
+        </w:tc>
+      </w:tr>
+      <w:tr>
+        <w:tc>
+          <w:tcPr>
+            <w:tcW w:type="dxa" w:w="1944"/>
+            <w:vAlign w:val="top"/>
+          </w:tcPr>
+          <w:p>
+            <w:pPr>
+              <w:spacing w:after="40"/>
+            </w:pPr>
+            <w:r>
+              <w:rPr>
+                <w:sz w:val="16"/>
+              </w:rPr>
+              <w:t>PayTabs / Paymes</w:t>
+            </w:r>
+          </w:p>
+        </w:tc>
+        <w:tc>
+          <w:tcPr>
+            <w:tcW w:type="dxa" w:w="2448"/>
+            <w:vAlign w:val="top"/>
+          </w:tcPr>
+          <w:p>
+            <w:pPr>
+              <w:spacing w:after="40"/>
+            </w:pPr>
+            <w:r>
+              <w:rPr>
+                <w:sz w:val="16"/>
+              </w:rPr>
+              <w:t>Pricing page shows SAR 49/month for standalone app, mada 1%, credit cards 2.25% + SAR 1; prices marked testing-phase and subject to change.</w:t>
+            </w:r>
+          </w:p>
+        </w:tc>
+        <w:tc>
+          <w:tcPr>
+            <w:tcW w:type="dxa" w:w="3024"/>
+            <w:vAlign w:val="top"/>
+          </w:tcPr>
+          <w:p>
+            <w:pPr>
+              <w:spacing w:after="40"/>
+            </w:pPr>
+            <w:r>
+              <w:rPr>
+                <w:sz w:val="16"/>
+              </w:rPr>
+              <w:t>Could help if the ready store/app workflow is valuable, but not the lowest fixed-cost option.</w:t>
+            </w:r>
+          </w:p>
+        </w:tc>
+        <w:tc>
+          <w:tcPr>
+            <w:tcW w:type="dxa" w:w="1944"/>
+            <w:vAlign w:val="top"/>
+          </w:tcPr>
+          <w:p>
+            <w:pPr>
+              <w:spacing w:after="40"/>
+            </w:pPr>
+            <w:r>
+              <w:rPr>
+                <w:sz w:val="16"/>
+              </w:rPr>
+              <w:t>Do not choose first if the goal is free monthly operation.</w:t>
+            </w:r>
+          </w:p>
+        </w:tc>
+      </w:tr>
+      <w:tr>
+        <w:tc>
+          <w:tcPr>
+            <w:tcW w:type="dxa" w:w="1944"/>
+            <w:vAlign w:val="top"/>
+          </w:tcPr>
+          <w:p>
+            <w:pPr>
+              <w:spacing w:after="40"/>
+            </w:pPr>
+            <w:r>
+              <w:rPr>
+                <w:sz w:val="16"/>
+              </w:rPr>
+              <w:t>PayPal Business Saudi Arabia</w:t>
+            </w:r>
+          </w:p>
+        </w:tc>
+        <w:tc>
+          <w:tcPr>
+            <w:tcW w:type="dxa" w:w="2448"/>
+            <w:vAlign w:val="top"/>
+          </w:tcPr>
+          <w:p>
+            <w:pPr>
+              <w:spacing w:after="40"/>
+            </w:pPr>
+            <w:r>
+              <w:rPr>
+                <w:sz w:val="16"/>
+              </w:rPr>
+              <w:t>Saudi business account signup exists; fees vary by PayPal terms and currency/withdrawal behavior.</w:t>
+            </w:r>
+          </w:p>
+        </w:tc>
+        <w:tc>
+          <w:tcPr>
+            <w:tcW w:type="dxa" w:w="3024"/>
+            <w:vAlign w:val="top"/>
+          </w:tcPr>
+          <w:p>
+            <w:pPr>
+              <w:spacing w:after="40"/>
+            </w:pPr>
+            <w:r>
+              <w:rPr>
+                <w:sz w:val="16"/>
+              </w:rPr>
+              <w:t>Useful for some international customers, but it does not solve the local mada/Apple Pay Saudi checkout need.</w:t>
+            </w:r>
+          </w:p>
+        </w:tc>
+        <w:tc>
+          <w:tcPr>
+            <w:tcW w:type="dxa" w:w="1944"/>
+            <w:vAlign w:val="top"/>
+          </w:tcPr>
+          <w:p>
+            <w:pPr>
+              <w:spacing w:after="40"/>
+            </w:pPr>
+            <w:r>
+              <w:rPr>
+                <w:sz w:val="16"/>
+              </w:rPr>
+              <w:t>Keep only as backup or later international option.</w:t>
+            </w:r>
+          </w:p>
+        </w:tc>
+      </w:tr>
+      <w:tr>
+        <w:tc>
+          <w:tcPr>
+            <w:tcW w:type="dxa" w:w="1944"/>
+            <w:vAlign w:val="top"/>
+          </w:tcPr>
+          <w:p>
+            <w:pPr>
+              <w:spacing w:after="40"/>
+            </w:pPr>
+            <w:r>
+              <w:rPr>
+                <w:sz w:val="16"/>
+              </w:rPr>
+              <w:t>Stripe</w:t>
+            </w:r>
+          </w:p>
+        </w:tc>
+        <w:tc>
+          <w:tcPr>
+            <w:tcW w:type="dxa" w:w="2448"/>
+            <w:vAlign w:val="top"/>
+          </w:tcPr>
+          <w:p>
+            <w:pPr>
+              <w:spacing w:after="40"/>
+            </w:pPr>
+            <w:r>
+              <w:rPr>
+                <w:sz w:val="16"/>
+              </w:rPr>
+              <w:t>Stripe global availability lists UAE, UK, US and many others, but not Saudi Arabia as a directly supported country.</w:t>
+            </w:r>
+          </w:p>
+        </w:tc>
+        <w:tc>
+          <w:tcPr>
+            <w:tcW w:type="dxa" w:w="3024"/>
+            <w:vAlign w:val="top"/>
+          </w:tcPr>
+          <w:p>
+            <w:pPr>
+              <w:spacing w:after="40"/>
+            </w:pPr>
+            <w:r>
+              <w:rPr>
+                <w:sz w:val="16"/>
+              </w:rPr>
+              <w:t>Excellent product where available, but unsuitable if the merchant entity/bank account is Saudi-only.</w:t>
+            </w:r>
+          </w:p>
+        </w:tc>
+        <w:tc>
+          <w:tcPr>
+            <w:tcW w:type="dxa" w:w="1944"/>
+            <w:vAlign w:val="top"/>
+          </w:tcPr>
+          <w:p>
+            <w:pPr>
+              <w:spacing w:after="40"/>
+            </w:pPr>
+            <w:r>
+              <w:rPr>
+                <w:sz w:val="16"/>
+              </w:rPr>
+              <w:t>Do not build Phase D around Stripe unless a supported-country entity is created.</w:t>
+            </w:r>
+          </w:p>
+        </w:tc>
+      </w:tr>
+      <w:tr>
+        <w:tc>
+          <w:tcPr>
+            <w:tcW w:type="dxa" w:w="1944"/>
+            <w:vAlign w:val="top"/>
+          </w:tcPr>
+          <w:p>
+            <w:pPr>
+              <w:spacing w:after="40"/>
+            </w:pPr>
+            <w:r>
+              <w:rPr>
+                <w:sz w:val="16"/>
+              </w:rPr>
+              <w:t>Amazon Payment Services</w:t>
+            </w:r>
+          </w:p>
+        </w:tc>
+        <w:tc>
+          <w:tcPr>
+            <w:tcW w:type="dxa" w:w="2448"/>
+            <w:vAlign w:val="top"/>
+          </w:tcPr>
+          <w:p>
+            <w:pPr>
+              <w:spacing w:after="40"/>
+            </w:pPr>
+            <w:r>
+              <w:rPr>
+                <w:sz w:val="16"/>
+              </w:rPr>
+              <w:t>Pricing page exists for Saudi Arabia but asks for business/volume selection; not positioned as the cheapest free-start route.</w:t>
+            </w:r>
+          </w:p>
+        </w:tc>
+        <w:tc>
+          <w:tcPr>
+            <w:tcW w:type="dxa" w:w="3024"/>
+            <w:vAlign w:val="top"/>
+          </w:tcPr>
+          <w:p>
+            <w:pPr>
+              <w:spacing w:after="40"/>
+            </w:pPr>
+            <w:r>
+              <w:rPr>
+                <w:sz w:val="16"/>
+              </w:rPr>
+              <w:t>Reliable larger-commerce provider with mada/local payment support.</w:t>
+            </w:r>
+          </w:p>
+        </w:tc>
+        <w:tc>
+          <w:tcPr>
+            <w:tcW w:type="dxa" w:w="1944"/>
+            <w:vAlign w:val="top"/>
+          </w:tcPr>
+          <w:p>
+            <w:pPr>
+              <w:spacing w:after="40"/>
+            </w:pPr>
+            <w:r>
+              <w:rPr>
+                <w:sz w:val="16"/>
+              </w:rPr>
+              <w:t>Consider later after launch volume or if enterprise reliability becomes the priority.</w:t>
+            </w:r>
+          </w:p>
+        </w:tc>
+      </w:tr>
+    </w:tbl>
+    <w:p>
+      <w:pPr>
+        <w:keepNext/>
+        <w:spacing w:before="200" w:after="120"/>
+      </w:pPr>
+      <w:r>
+        <w:rPr>
+          <w:b/>
+          <w:sz w:val="24"/>
+        </w:rPr>
+        <w:t>Recommended Launch Path</w:t>
+      </w:r>
+    </w:p>
+    <w:p>
+      <w:pPr>
+        <w:spacing w:after="80"/>
+        <w:ind w:left="360" w:hanging="280"/>
+      </w:pPr>
+      <w:r>
+        <w:rPr>
+          <w:sz w:val="19"/>
+        </w:rPr>
+        <w:t xml:space="preserve">1. </w:t>
+      </w:r>
+      <w:r>
+        <w:rPr>
+          <w:b/>
+          <w:sz w:val="19"/>
+        </w:rPr>
+        <w:t xml:space="preserve">Phase D0 - now: </w:t>
+      </w:r>
+      <w:r>
+        <w:rPr>
+          <w:sz w:val="19"/>
+        </w:rPr>
+        <w:t>Keep WhatsApp checkout live. Add operational copy: "Payment is confirmed on WhatsApp by payment link or bank transfer." Do not store card data.</w:t>
+      </w:r>
+    </w:p>
+    <w:p>
+      <w:pPr>
+        <w:spacing w:after="80"/>
+        <w:ind w:left="360" w:hanging="280"/>
+      </w:pPr>
+      <w:r>
+        <w:rPr>
+          <w:sz w:val="19"/>
+        </w:rPr>
+        <w:t xml:space="preserve">2. </w:t>
+      </w:r>
+      <w:r>
+        <w:rPr>
+          <w:b/>
+          <w:sz w:val="19"/>
+        </w:rPr>
+        <w:t xml:space="preserve">Phase D1 - cheapest gateway pilot: </w:t>
+      </w:r>
+      <w:r>
+        <w:rPr>
+          <w:sz w:val="19"/>
+        </w:rPr>
+        <w:t>Open Paylink merchant onboarding and verify free setup/monthly terms, required CR/freelance certificate, settlement timing, refund flow, and whether payment links can be generated manually from dashboard.</w:t>
+      </w:r>
+    </w:p>
+    <w:p>
+      <w:pPr>
+        <w:spacing w:after="80"/>
+        <w:ind w:left="360" w:hanging="280"/>
+      </w:pPr>
+      <w:r>
+        <w:rPr>
+          <w:sz w:val="19"/>
+        </w:rPr>
+        <w:t xml:space="preserve">3. </w:t>
+      </w:r>
+      <w:r>
+        <w:rPr>
+          <w:b/>
+          <w:sz w:val="19"/>
+        </w:rPr>
+        <w:t xml:space="preserve">Phase D2 - quote comparison: </w:t>
+      </w:r>
+      <w:r>
+        <w:rPr>
+          <w:sz w:val="19"/>
+        </w:rPr>
+        <w:t>Ask Tap and Moyasar for written rates for mada, Visa/Mastercard, Apple Pay, STC Pay, payment links, refunds, chargebacks, settlement time, and minimum monthly fee. Pick only if their total cost or UX beats Paylink.</w:t>
+      </w:r>
+    </w:p>
+    <w:p>
+      <w:pPr>
+        <w:spacing w:after="80"/>
+        <w:ind w:left="360" w:hanging="280"/>
+      </w:pPr>
+      <w:r>
+        <w:rPr>
+          <w:sz w:val="19"/>
+        </w:rPr>
+        <w:t xml:space="preserve">4. </w:t>
+      </w:r>
+      <w:r>
+        <w:rPr>
+          <w:b/>
+          <w:sz w:val="19"/>
+        </w:rPr>
+        <w:t xml:space="preserve">Phase D3 - automation: </w:t>
+      </w:r>
+      <w:r>
+        <w:rPr>
+          <w:sz w:val="19"/>
+        </w:rPr>
+        <w:t>Use Supabase Edge Functions for payment creation and webhooks. Store only order id, provider payment id, amount, status, and audit trail. Never put secret keys in website/app.js, config.local.js, GitHub public variables, or browser storage.</w:t>
+      </w:r>
+    </w:p>
+    <w:p>
+      <w:pPr>
+        <w:spacing w:after="80"/>
+        <w:ind w:left="360" w:hanging="280"/>
+      </w:pPr>
+      <w:r>
+        <w:rPr>
+          <w:sz w:val="19"/>
+        </w:rPr>
+        <w:t xml:space="preserve">5. </w:t>
+      </w:r>
+      <w:r>
+        <w:rPr>
+          <w:b/>
+          <w:sz w:val="19"/>
+        </w:rPr>
+        <w:t xml:space="preserve">Phase D4 - checkout upgrade: </w:t>
+      </w:r>
+      <w:r>
+        <w:rPr>
+          <w:sz w:val="19"/>
+        </w:rPr>
+        <w:t>Add "Pay securely" after an order is created. The static site should call an Edge Function, receive a hosted payment URL, redirect the customer, then update order status by webhook.</w:t>
+      </w:r>
+    </w:p>
+    <w:p>
+      <w:pPr>
+        <w:keepNext/>
+        <w:spacing w:before="200" w:after="120"/>
+      </w:pPr>
+      <w:r>
+        <w:rPr>
+          <w:b/>
+          <w:sz w:val="24"/>
+        </w:rPr>
+        <w:t>Cost Examples For Current Products</w:t>
+      </w:r>
+    </w:p>
+    <w:p>
+      <w:r>
+        <w:t>Approximate Paylink-style fee examples, using public terms shown in the Paylink search result. Confirm during onboarding before relying on them in pricing.</w:t>
+      </w:r>
+    </w:p>
+    <w:tbl>
+      <w:tblPr>
+        <w:tblW w:type="auto" w:w="0"/>
+        <w:tblLook w:firstColumn="1" w:firstRow="1" w:lastColumn="0" w:lastRow="0" w:noHBand="0" w:noVBand="1" w:val="04A0"/>
+        <w:jc w:val="center"/>
+        <w:tblBorders>
+          <w:top w:val="single" w:sz="4" w:space="0" w:color="C8BFAF"/>
+          <w:left w:val="single" w:sz="4" w:space="0" w:color="C8BFAF"/>
+          <w:bottom w:val="single" w:sz="4" w:space="0" w:color="C8BFAF"/>
+          <w:right w:val="single" w:sz="4" w:space="0" w:color="C8BFAF"/>
+          <w:insideH w:val="single" w:sz="4" w:space="0" w:color="C8BFAF"/>
+          <w:insideV w:val="single" w:sz="4" w:space="0" w:color="C8BFAF"/>
+        </w:tblBorders>
+      </w:tblPr>
+      <w:tblGrid>
+        <w:gridCol w:w="1901"/>
+        <w:gridCol w:w="1901"/>
+        <w:gridCol w:w="1901"/>
+        <w:gridCol w:w="1901"/>
+        <w:gridCol w:w="1901"/>
+      </w:tblGrid>
+      <w:tr>
+        <w:tc>
+          <w:tcPr>
+            <w:tcW w:type="dxa" w:w="1901"/>
+          </w:tcPr>
+          <w:p>
+            <w:r>
+              <w:rPr>
+                <w:b/>
+                <w:sz w:val="17"/>
+              </w:rPr>
+              <w:t>Product</w:t>
+            </w:r>
+          </w:p>
+        </w:tc>
+        <w:tc>
+          <w:tcPr>
+            <w:tcW w:type="dxa" w:w="1901"/>
+          </w:tcPr>
+          <w:p>
+            <w:r>
+              <w:rPr>
+                <w:b/>
+                <w:sz w:val="17"/>
+              </w:rPr>
+              <w:t>Price</w:t>
+            </w:r>
+          </w:p>
+        </w:tc>
+        <w:tc>
+          <w:tcPr>
+            <w:tcW w:type="dxa" w:w="1901"/>
+          </w:tcPr>
+          <w:p>
+            <w:r>
+              <w:rPr>
+                <w:b/>
+                <w:sz w:val="17"/>
+              </w:rPr>
+              <w:t>mada 1% + SAR 1</w:t>
+            </w:r>
+          </w:p>
+        </w:tc>
+        <w:tc>
+          <w:tcPr>
+            <w:tcW w:type="dxa" w:w="1901"/>
+          </w:tcPr>
+          <w:p>
+            <w:r>
+              <w:rPr>
+                <w:b/>
+                <w:sz w:val="17"/>
+              </w:rPr>
+              <w:t>Visa/MC 2.75% + SAR 1</w:t>
+            </w:r>
+          </w:p>
+        </w:tc>
+        <w:tc>
+          <w:tcPr>
+            <w:tcW w:type="dxa" w:w="1901"/>
+          </w:tcPr>
+          <w:p>
+            <w:r>
+              <w:rPr>
+                <w:b/>
+                <w:sz w:val="17"/>
+              </w:rPr>
+              <w:t>Notes</w:t>
+            </w:r>
+          </w:p>
+        </w:tc>
+      </w:tr>
+      <w:tr>
+        <w:tc>
+          <w:tcPr>
+            <w:tcW w:type="dxa" w:w="1901"/>
+          </w:tcPr>
+          <w:p>
+            <w:pPr>
+              <w:spacing w:after="40"/>
+            </w:pPr>
+            <w:r>
+              <w:rPr>
+                <w:sz w:val="16"/>
+              </w:rPr>
+              <w:t>Discovery Set</w:t>
+            </w:r>
+          </w:p>
+        </w:tc>
+        <w:tc>
+          <w:tcPr>
+            <w:tcW w:type="dxa" w:w="1901"/>
+          </w:tcPr>
+          <w:p>
+            <w:pPr>
+              <w:spacing w:after="40"/>
+            </w:pPr>
+            <w:r>
+              <w:rPr>
+                <w:sz w:val="16"/>
+              </w:rPr>
+              <w:t>SAR 60</w:t>
+            </w:r>
+          </w:p>
+        </w:tc>
+        <w:tc>
+          <w:tcPr>
+            <w:tcW w:type="dxa" w:w="1901"/>
+          </w:tcPr>
+          <w:p>
+            <w:pPr>
+              <w:spacing w:after="40"/>
+            </w:pPr>
+            <w:r>
+              <w:rPr>
+                <w:sz w:val="16"/>
+              </w:rPr>
+              <w:t>SAR 1.60</w:t>
+            </w:r>
+          </w:p>
+        </w:tc>
+        <w:tc>
+          <w:tcPr>
+            <w:tcW w:type="dxa" w:w="1901"/>
+          </w:tcPr>
+          <w:p>
+            <w:pPr>
+              <w:spacing w:after="40"/>
+            </w:pPr>
+            <w:r>
+              <w:rPr>
+                <w:sz w:val="16"/>
+              </w:rPr>
+              <w:t>SAR 2.65</w:t>
+            </w:r>
+          </w:p>
+        </w:tc>
+        <w:tc>
+          <w:tcPr>
+            <w:tcW w:type="dxa" w:w="1901"/>
+          </w:tcPr>
+          <w:p>
+            <w:pPr>
+              <w:spacing w:after="40"/>
+            </w:pPr>
+            <w:r>
+              <w:rPr>
+                <w:sz w:val="16"/>
+              </w:rPr>
+              <w:t>Use as margin planning, not final provider quote.</w:t>
+            </w:r>
+          </w:p>
+        </w:tc>
+      </w:tr>
+      <w:tr>
+        <w:tc>
+          <w:tcPr>
+            <w:tcW w:type="dxa" w:w="1901"/>
+          </w:tcPr>
+          <w:p>
+            <w:pPr>
+              <w:spacing w:after="40"/>
+            </w:pPr>
+            <w:r>
+              <w:rPr>
+                <w:sz w:val="16"/>
+              </w:rPr>
+              <w:t>Duo Box</w:t>
+            </w:r>
+          </w:p>
+        </w:tc>
+        <w:tc>
+          <w:tcPr>
+            <w:tcW w:type="dxa" w:w="1901"/>
+          </w:tcPr>
+          <w:p>
+            <w:pPr>
+              <w:spacing w:after="40"/>
+            </w:pPr>
+            <w:r>
+              <w:rPr>
+                <w:sz w:val="16"/>
+              </w:rPr>
+              <w:t>SAR 499</w:t>
+            </w:r>
+          </w:p>
+        </w:tc>
+        <w:tc>
+          <w:tcPr>
+            <w:tcW w:type="dxa" w:w="1901"/>
+          </w:tcPr>
+          <w:p>
+            <w:pPr>
+              <w:spacing w:after="40"/>
+            </w:pPr>
+            <w:r>
+              <w:rPr>
+                <w:sz w:val="16"/>
+              </w:rPr>
+              <w:t>SAR 5.99</w:t>
+            </w:r>
+          </w:p>
+        </w:tc>
+        <w:tc>
+          <w:tcPr>
+            <w:tcW w:type="dxa" w:w="1901"/>
+          </w:tcPr>
+          <w:p>
+            <w:pPr>
+              <w:spacing w:after="40"/>
+            </w:pPr>
+            <w:r>
+              <w:rPr>
+                <w:sz w:val="16"/>
+              </w:rPr>
+              <w:t>SAR 14.72</w:t>
+            </w:r>
+          </w:p>
+        </w:tc>
+        <w:tc>
+          <w:tcPr>
+            <w:tcW w:type="dxa" w:w="1901"/>
+          </w:tcPr>
+          <w:p>
+            <w:pPr>
+              <w:spacing w:after="40"/>
+            </w:pPr>
+            <w:r>
+              <w:rPr>
+                <w:sz w:val="16"/>
+              </w:rPr>
+              <w:t>Use as margin planning, not final provider quote.</w:t>
+            </w:r>
+          </w:p>
+        </w:tc>
+      </w:tr>
+      <w:tr>
+        <w:tc>
+          <w:tcPr>
+            <w:tcW w:type="dxa" w:w="1901"/>
+          </w:tcPr>
+          <w:p>
+            <w:pPr>
+              <w:spacing w:after="40"/>
+            </w:pPr>
+            <w:r>
+              <w:rPr>
+                <w:sz w:val="16"/>
+              </w:rPr>
+              <w:t>ASMR 50 ml</w:t>
+            </w:r>
+          </w:p>
+        </w:tc>
+        <w:tc>
+          <w:tcPr>
+            <w:tcW w:type="dxa" w:w="1901"/>
+          </w:tcPr>
+          <w:p>
+            <w:pPr>
+              <w:spacing w:after="40"/>
+            </w:pPr>
+            <w:r>
+              <w:rPr>
+                <w:sz w:val="16"/>
+              </w:rPr>
+              <w:t>SAR 320</w:t>
+            </w:r>
+          </w:p>
+        </w:tc>
+        <w:tc>
+          <w:tcPr>
+            <w:tcW w:type="dxa" w:w="1901"/>
+          </w:tcPr>
+          <w:p>
+            <w:pPr>
+              <w:spacing w:after="40"/>
+            </w:pPr>
+            <w:r>
+              <w:rPr>
+                <w:sz w:val="16"/>
+              </w:rPr>
+              <w:t>SAR 4.20</w:t>
+            </w:r>
+          </w:p>
+        </w:tc>
+        <w:tc>
+          <w:tcPr>
+            <w:tcW w:type="dxa" w:w="1901"/>
+          </w:tcPr>
+          <w:p>
+            <w:pPr>
+              <w:spacing w:after="40"/>
+            </w:pPr>
+            <w:r>
+              <w:rPr>
+                <w:sz w:val="16"/>
+              </w:rPr>
+              <w:t>SAR 9.80</w:t>
+            </w:r>
+          </w:p>
+        </w:tc>
+        <w:tc>
+          <w:tcPr>
+            <w:tcW w:type="dxa" w:w="1901"/>
+          </w:tcPr>
+          <w:p>
+            <w:pPr>
+              <w:spacing w:after="40"/>
+            </w:pPr>
+            <w:r>
+              <w:rPr>
+                <w:sz w:val="16"/>
+              </w:rPr>
+              <w:t>Use as margin planning, not final provider quote.</w:t>
+            </w:r>
+          </w:p>
+        </w:tc>
+      </w:tr>
+      <w:tr>
+        <w:tc>
+          <w:tcPr>
+            <w:tcW w:type="dxa" w:w="1901"/>
+          </w:tcPr>
+          <w:p>
+            <w:pPr>
+              <w:spacing w:after="40"/>
+            </w:pPr>
+            <w:r>
+              <w:rPr>
+                <w:sz w:val="16"/>
+              </w:rPr>
+              <w:t>SAMR 50 ml</w:t>
+            </w:r>
+          </w:p>
+        </w:tc>
+        <w:tc>
+          <w:tcPr>
+            <w:tcW w:type="dxa" w:w="1901"/>
+          </w:tcPr>
+          <w:p>
+            <w:pPr>
+              <w:spacing w:after="40"/>
+            </w:pPr>
+            <w:r>
+              <w:rPr>
+                <w:sz w:val="16"/>
+              </w:rPr>
+              <w:t>SAR 230</w:t>
+            </w:r>
+          </w:p>
+        </w:tc>
+        <w:tc>
+          <w:tcPr>
+            <w:tcW w:type="dxa" w:w="1901"/>
+          </w:tcPr>
+          <w:p>
+            <w:pPr>
+              <w:spacing w:after="40"/>
+            </w:pPr>
+            <w:r>
+              <w:rPr>
+                <w:sz w:val="16"/>
+              </w:rPr>
+              <w:t>SAR 3.30</w:t>
+            </w:r>
+          </w:p>
+        </w:tc>
+        <w:tc>
+          <w:tcPr>
+            <w:tcW w:type="dxa" w:w="1901"/>
+          </w:tcPr>
+          <w:p>
+            <w:pPr>
+              <w:spacing w:after="40"/>
+            </w:pPr>
+            <w:r>
+              <w:rPr>
+                <w:sz w:val="16"/>
+              </w:rPr>
+              <w:t>SAR 7.33</w:t>
+            </w:r>
+          </w:p>
+        </w:tc>
+        <w:tc>
+          <w:tcPr>
+            <w:tcW w:type="dxa" w:w="1901"/>
+          </w:tcPr>
+          <w:p>
+            <w:pPr>
+              <w:spacing w:after="40"/>
+            </w:pPr>
+            <w:r>
+              <w:rPr>
+                <w:sz w:val="16"/>
+              </w:rPr>
+              <w:t>Use as margin planning, not final provider quote.</w:t>
+            </w:r>
+          </w:p>
+        </w:tc>
+      </w:tr>
+    </w:tbl>
+    <w:p>
+      <w:pPr>
+        <w:keepNext/>
+        <w:spacing w:before="200" w:after="120"/>
+      </w:pPr>
+      <w:r>
+        <w:rPr>
+          <w:b/>
+          <w:sz w:val="24"/>
+        </w:rPr>
+        <w:t>Provider Questions Before Choosing</w:t>
+      </w:r>
+    </w:p>
+    <w:p>
+      <w:pPr>
+        <w:spacing w:after="60"/>
+        <w:ind w:left="360" w:hanging="200"/>
+      </w:pPr>
+      <w:r>
+        <w:rPr>
+          <w:sz w:val="19"/>
+        </w:rPr>
+        <w:t xml:space="preserve">- </w:t>
+      </w:r>
+      <w:r>
+        <w:rPr>
+          <w:sz w:val="19"/>
+        </w:rPr>
+        <w:t>Is there any setup fee, monthly fee, minimum volume, or annual commitment?</w:t>
+      </w:r>
+    </w:p>
+    <w:p>
+      <w:pPr>
+        <w:spacing w:after="60"/>
+        <w:ind w:left="360" w:hanging="200"/>
+      </w:pPr>
+      <w:r>
+        <w:rPr>
+          <w:sz w:val="19"/>
+        </w:rPr>
+        <w:t xml:space="preserve">- </w:t>
+      </w:r>
+      <w:r>
+        <w:rPr>
+          <w:sz w:val="19"/>
+        </w:rPr>
+        <w:t>What are the exact fees for mada, Visa/Mastercard, Apple Pay, STC Pay, refunds, chargebacks, and failed transactions?</w:t>
+      </w:r>
+    </w:p>
+    <w:p>
+      <w:pPr>
+        <w:spacing w:after="60"/>
+        <w:ind w:left="360" w:hanging="200"/>
+      </w:pPr>
+      <w:r>
+        <w:rPr>
+          <w:sz w:val="19"/>
+        </w:rPr>
+        <w:t xml:space="preserve">- </w:t>
+      </w:r>
+      <w:r>
+        <w:rPr>
+          <w:sz w:val="19"/>
+        </w:rPr>
+        <w:t>What documents are required: CR, freelance certificate, VAT certificate, bank IBAN, national ID, website policies, product restrictions?</w:t>
+      </w:r>
+    </w:p>
+    <w:p>
+      <w:pPr>
+        <w:spacing w:after="60"/>
+        <w:ind w:left="360" w:hanging="200"/>
+      </w:pPr>
+      <w:r>
+        <w:rPr>
+          <w:sz w:val="19"/>
+        </w:rPr>
+        <w:t xml:space="preserve">- </w:t>
+      </w:r>
+      <w:r>
+        <w:rPr>
+          <w:sz w:val="19"/>
+        </w:rPr>
+        <w:t>How fast is settlement for mada and cards, and which Saudi banks are supported?</w:t>
+      </w:r>
+    </w:p>
+    <w:p>
+      <w:pPr>
+        <w:spacing w:after="60"/>
+        <w:ind w:left="360" w:hanging="200"/>
+      </w:pPr>
+      <w:r>
+        <w:rPr>
+          <w:sz w:val="19"/>
+        </w:rPr>
+        <w:t xml:space="preserve">- </w:t>
+      </w:r>
+      <w:r>
+        <w:rPr>
+          <w:sz w:val="19"/>
+        </w:rPr>
+        <w:t>Can we start with manual payment links and later integrate API/webhooks without changing the merchant account?</w:t>
+      </w:r>
+    </w:p>
+    <w:p>
+      <w:pPr>
+        <w:spacing w:after="60"/>
+        <w:ind w:left="360" w:hanging="200"/>
+      </w:pPr>
+      <w:r>
+        <w:rPr>
+          <w:sz w:val="19"/>
+        </w:rPr>
+        <w:t xml:space="preserve">- </w:t>
+      </w:r>
+      <w:r>
+        <w:rPr>
+          <w:sz w:val="19"/>
+        </w:rPr>
+        <w:t>Does the provider support perfume/fragrance ecommerce without category restrictions?</w:t>
+      </w:r>
+    </w:p>
+    <w:p>
+      <w:pPr>
+        <w:keepNext/>
+        <w:spacing w:before="200" w:after="120"/>
+      </w:pPr>
+      <w:r>
+        <w:rPr>
+          <w:b/>
+          <w:sz w:val="24"/>
+        </w:rPr>
+        <w:t>Sources Checked</w:t>
+      </w:r>
+    </w:p>
+    <w:p>
+      <w:pPr>
+        <w:spacing w:after="60"/>
+        <w:ind w:left="360" w:hanging="200"/>
+      </w:pPr>
+      <w:r>
+        <w:rPr>
+          <w:sz w:val="19"/>
+        </w:rPr>
+        <w:t xml:space="preserve">- </w:t>
+      </w:r>
+      <w:r>
+        <w:rPr>
+          <w:sz w:val="19"/>
+        </w:rPr>
+        <w:t>Paylink terms/pricing page: https://paylink.sa/catalog/terms</w:t>
+      </w:r>
+    </w:p>
+    <w:p>
+      <w:pPr>
+        <w:spacing w:after="60"/>
+        <w:ind w:left="360" w:hanging="200"/>
+      </w:pPr>
+      <w:r>
+        <w:rPr>
+          <w:sz w:val="19"/>
+        </w:rPr>
+        <w:t xml:space="preserve">- </w:t>
+      </w:r>
+      <w:r>
+        <w:rPr>
+          <w:sz w:val="19"/>
+        </w:rPr>
+        <w:t>Tap Payments Saudi page: https://www.tap.company/en-sa</w:t>
+      </w:r>
+    </w:p>
+    <w:p>
+      <w:pPr>
+        <w:spacing w:after="60"/>
+        <w:ind w:left="360" w:hanging="200"/>
+      </w:pPr>
+      <w:r>
+        <w:rPr>
+          <w:sz w:val="19"/>
+        </w:rPr>
+        <w:t xml:space="preserve">- </w:t>
+      </w:r>
+      <w:r>
+        <w:rPr>
+          <w:sz w:val="19"/>
+        </w:rPr>
+        <w:t>Moyasar homepage and startup/freelancer page: https://moyasar.com/en/ and https://moyasar.com/en/solutions/startups-and-freelancers/</w:t>
+      </w:r>
+    </w:p>
+    <w:p>
+      <w:pPr>
+        <w:spacing w:after="60"/>
+        <w:ind w:left="360" w:hanging="200"/>
+      </w:pPr>
+      <w:r>
+        <w:rPr>
+          <w:sz w:val="19"/>
+        </w:rPr>
+        <w:t xml:space="preserve">- </w:t>
+      </w:r>
+      <w:r>
+        <w:rPr>
+          <w:sz w:val="19"/>
+        </w:rPr>
+        <w:t>PayTabs pricing page: https://paytabs.com/en/pricing/</w:t>
+      </w:r>
+    </w:p>
+    <w:p>
+      <w:pPr>
+        <w:spacing w:after="60"/>
+        <w:ind w:left="360" w:hanging="200"/>
+      </w:pPr>
+      <w:r>
+        <w:rPr>
+          <w:sz w:val="19"/>
+        </w:rPr>
+        <w:t xml:space="preserve">- </w:t>
+      </w:r>
+      <w:r>
+        <w:rPr>
+          <w:sz w:val="19"/>
+        </w:rPr>
+        <w:t>Stripe global availability: https://stripe.com/global</w:t>
+      </w:r>
+    </w:p>
+    <w:p>
+      <w:pPr>
+        <w:spacing w:after="60"/>
+        <w:ind w:left="360" w:hanging="200"/>
+      </w:pPr>
+      <w:r>
+        <w:rPr>
+          <w:sz w:val="19"/>
+        </w:rPr>
+        <w:t xml:space="preserve">- </w:t>
+      </w:r>
+      <w:r>
+        <w:rPr>
+          <w:sz w:val="19"/>
+        </w:rPr>
+        <w:t>PayPal Saudi business account page: https://www.paypal.com/sa/business/open-business-account</w:t>
+      </w:r>
+    </w:p>
+    <w:p>
+      <w:pPr>
+        <w:spacing w:after="60"/>
+        <w:ind w:left="360" w:hanging="200"/>
+      </w:pPr>
+      <w:r>
+        <w:rPr>
+          <w:sz w:val="19"/>
+        </w:rPr>
+        <w:t xml:space="preserve">- </w:t>
+      </w:r>
+      <w:r>
+        <w:rPr>
+          <w:sz w:val="19"/>
+        </w:rPr>
+        <w:t>mada official page: https://www.mada.com.sa/en</w:t>
+      </w:r>
+    </w:p>
+    <w:p>
+      <w:pPr>
+        <w:spacing w:after="60"/>
+        <w:ind w:left="360" w:hanging="200"/>
+      </w:pPr>
+      <w:r>
+        <w:rPr>
+          <w:sz w:val="19"/>
+        </w:rPr>
+        <w:t xml:space="preserve">- </w:t>
+      </w:r>
+      <w:r>
+        <w:rPr>
+          <w:sz w:val="19"/>
+        </w:rPr>
+        <w:t>Apple Pay Saudi page: https://www.apple.com/sa/apple-pay/</w:t>
+      </w:r>
+    </w:p>
+    <w:p>
+      <w:pPr>
+        <w:spacing w:after="60"/>
+        <w:ind w:left="360" w:hanging="200"/>
+      </w:pPr>
+      <w:r>
+        <w:rPr>
+          <w:sz w:val="19"/>
+        </w:rPr>
+        <w:t xml:space="preserve">- </w:t>
+      </w:r>
+      <w:r>
+        <w:rPr>
+          <w:sz w:val="19"/>
+        </w:rPr>
+        <w:t>Amazon Payment Services pricing page: https://paymentservices.amazon.com/pricing</w:t>
+      </w:r>
+    </w:p>
+    <w:p>
+      <w:pPr>
+        <w:keepNext/>
+        <w:spacing w:before="200" w:after="120"/>
+      </w:pPr>
+      <w:r>
+        <w:rPr>
+          <w:b/>
+          <w:sz w:val="24"/>
+        </w:rPr>
+        <w:t>Immediate Next Action</w:t>
+      </w:r>
+    </w:p>
+    <w:p>
+      <w:r>
+        <w:rPr>
+          <w:b/>
+        </w:rPr>
+        <w:t xml:space="preserve">Do this first: </w:t>
+      </w:r>
+      <w:r>
+        <w:t>Open Paylink onboarding and request written confirmation of free setup/monthly, exact transaction fees, settlement timing, and payment-link/API/webhook support. In parallel, request Tap and Moyasar quotes using the same product prices and expected low monthly launch volume. Do not code card payment integration until one provider account is approved and secret keys are stored server-side only.</w:t>
       </w:r>
     </w:p>
     <w:sectPr>

</xml_diff>